<commit_message>
DU study edition 2: beta re-based to FTSE ADX General per instruction
Beta 0.488 (ADX, R2 0.120, n 256, gate passed); DFM General 0.472 and
AE-composite 0.400 published as alternatives. Central 14.98 -> 14.77,
DCF A/B 18.74/15.95, WACC 6.32%->6.08%. All verification gates re-run
green on the rebuilt deliverables (recalc 729/729, driver test 22/22,
scrub/width/figure checks, SIGCM + model-study bar).

Co-Authored-By: Claude Fable 5 <noreply@anthropic.com>
Claude-Session: https://claude.ai/code/session_01J3X4qpLFhfa6a9G3h2HreB
</commit_message>
<xml_diff>
--- a/engine/du_study/DU_Bibliography_09-08-2026.docx
+++ b/engine/du_study/DU_Bibliography_09-08-2026.docx
@@ -1584,7 +1584,7 @@
                 <w:color w:val="1C3A36"/>
                 <w:sz w:val="14"/>
               </w:rPr>
-              <w:t>0.472</w:t>
+              <w:t>0.488</w:t>
             </w:r>
           </w:p>
         </w:tc>
@@ -1601,7 +1601,7 @@
                 <w:color w:val="1C3A36"/>
                 <w:sz w:val="14"/>
               </w:rPr>
-              <w:t>Tier-1 own-stock regression: DU weekly log-returns vs the DFM General Index (official DFM API spliced with cross-validated Yahoo DFMGI.AE; identical closes on all 307 overlapping sessions), 5-year window, last-common-session weekly sampling: beta 0.472, R2 0.202, n 259, SE 0.058, CI90 [0.38, 0.57] - passes the usability gate (n&gt;=24, R2&gt;=5%, SE&lt;|beta|). Equal-weight AE-library composite cross-check: 0.394 (R2 0.118). A defensive, negative-net-debt telecom regressing below 0.5 on its own index is economically coherent; betas of 0.6 and 0.8 are PRICED in the sensitivity grid</w:t>
+              <w:t>Own-stock regression vs the FTSE ADX GENERAL INDEX, adopted per explicit user instruction (10-Aug-2026) as the UAE base market index: DU weekly log-returns, 5-year window, last-common-session weekly sampling on the user-supplied index export (2011..24-Jul-2026): beta 0.488, R2 0.120, n 256, SE 0.083, CI90 [0.35, 0.62] - passes the usability gate (n&gt;=24, R2&gt;=5%, SE&lt;|beta|). Published alternatives: DFM General (DU's own listing venue, the house default) 0.472 (R2 0.202, SE 0.058); equal-weight AE-library composite 0.400. A defensive, negative-net-debt telecom regressing below 0.5 on either UAE index is economically coherent; betas at the CI ends and 0.65/0.80 priors are PRICED in the sensitivity grid</w:t>
             </w:r>
           </w:p>
         </w:tc>
@@ -1618,7 +1618,7 @@
                 <w:color w:val="1C3A36"/>
                 <w:sz w:val="14"/>
               </w:rPr>
-              <w:t>2026-08-09</w:t>
+              <w:t>2026-08-10</w:t>
             </w:r>
           </w:p>
         </w:tc>

</xml_diff>